<commit_message>
Started processing sketch and added some of my observations
</commit_message>
<xml_diff>
--- a/mydata.docx
+++ b/mydata.docx
@@ -4,9 +4,1136 @@
   <w:body>
     <w:p>
       <w:r>
-        <w:t>m</w:t>
+        <w:t>How often do I check the time?</w:t>
       </w:r>
     </w:p>
+    <w:tbl>
+      <w:tblPr>
+        <w:tblStyle w:val="TableGrid"/>
+        <w:tblW w:w="0" w:type="auto"/>
+        <w:tblLook w:val="04A0" w:firstRow="1" w:lastRow="0" w:firstColumn="1" w:lastColumn="0" w:noHBand="0" w:noVBand="1"/>
+      </w:tblPr>
+      <w:tblGrid>
+        <w:gridCol w:w="1803"/>
+        <w:gridCol w:w="1803"/>
+        <w:gridCol w:w="1803"/>
+        <w:gridCol w:w="1803"/>
+        <w:gridCol w:w="1804"/>
+      </w:tblGrid>
+      <w:tr>
+        <w:tc>
+          <w:tcPr>
+            <w:tcW w:w="1803" w:type="dxa"/>
+          </w:tcPr>
+          <w:p>
+            <w:r>
+              <w:t>No.</w:t>
+            </w:r>
+          </w:p>
+          <w:p/>
+          <w:p/>
+        </w:tc>
+        <w:tc>
+          <w:tcPr>
+            <w:tcW w:w="1803" w:type="dxa"/>
+          </w:tcPr>
+          <w:p>
+            <w:r>
+              <w:t>Date</w:t>
+            </w:r>
+          </w:p>
+        </w:tc>
+        <w:tc>
+          <w:tcPr>
+            <w:tcW w:w="1803" w:type="dxa"/>
+          </w:tcPr>
+          <w:p>
+            <w:r>
+              <w:t>Time</w:t>
+            </w:r>
+          </w:p>
+        </w:tc>
+        <w:tc>
+          <w:tcPr>
+            <w:tcW w:w="1803" w:type="dxa"/>
+          </w:tcPr>
+          <w:p>
+            <w:r>
+              <w:t>Reason</w:t>
+            </w:r>
+          </w:p>
+        </w:tc>
+        <w:tc>
+          <w:tcPr>
+            <w:tcW w:w="1804" w:type="dxa"/>
+          </w:tcPr>
+          <w:p>
+            <w:r>
+              <w:t xml:space="preserve">Device </w:t>
+            </w:r>
+          </w:p>
+        </w:tc>
+      </w:tr>
+      <w:tr>
+        <w:trPr>
+          <w:trHeight w:val="50"/>
+        </w:trPr>
+        <w:tc>
+          <w:tcPr>
+            <w:tcW w:w="1803" w:type="dxa"/>
+          </w:tcPr>
+          <w:p>
+            <w:r>
+              <w:t>1</w:t>
+            </w:r>
+          </w:p>
+        </w:tc>
+        <w:tc>
+          <w:tcPr>
+            <w:tcW w:w="1803" w:type="dxa"/>
+          </w:tcPr>
+          <w:p>
+            <w:r>
+              <w:t>12/10/26</w:t>
+            </w:r>
+          </w:p>
+        </w:tc>
+        <w:tc>
+          <w:tcPr>
+            <w:tcW w:w="1803" w:type="dxa"/>
+          </w:tcPr>
+          <w:p>
+            <w:r>
+              <w:t>07:12</w:t>
+            </w:r>
+          </w:p>
+        </w:tc>
+        <w:tc>
+          <w:tcPr>
+            <w:tcW w:w="1803" w:type="dxa"/>
+          </w:tcPr>
+          <w:p>
+            <w:r>
+              <w:t>Just woke up</w:t>
+            </w:r>
+          </w:p>
+        </w:tc>
+        <w:tc>
+          <w:tcPr>
+            <w:tcW w:w="1804" w:type="dxa"/>
+          </w:tcPr>
+          <w:p>
+            <w:r>
+              <w:t xml:space="preserve">Phone </w:t>
+            </w:r>
+          </w:p>
+        </w:tc>
+      </w:tr>
+      <w:tr>
+        <w:tc>
+          <w:tcPr>
+            <w:tcW w:w="1803" w:type="dxa"/>
+          </w:tcPr>
+          <w:p>
+            <w:r>
+              <w:t>2</w:t>
+            </w:r>
+          </w:p>
+        </w:tc>
+        <w:tc>
+          <w:tcPr>
+            <w:tcW w:w="1803" w:type="dxa"/>
+          </w:tcPr>
+          <w:p>
+            <w:r>
+              <w:t>12/10/26</w:t>
+            </w:r>
+          </w:p>
+        </w:tc>
+        <w:tc>
+          <w:tcPr>
+            <w:tcW w:w="1803" w:type="dxa"/>
+          </w:tcPr>
+          <w:p>
+            <w:r>
+              <w:t>08:18</w:t>
+            </w:r>
+          </w:p>
+        </w:tc>
+        <w:tc>
+          <w:tcPr>
+            <w:tcW w:w="1803" w:type="dxa"/>
+          </w:tcPr>
+          <w:p>
+            <w:r>
+              <w:t>Checking if I’m late for Uni</w:t>
+            </w:r>
+          </w:p>
+        </w:tc>
+        <w:tc>
+          <w:tcPr>
+            <w:tcW w:w="1804" w:type="dxa"/>
+          </w:tcPr>
+          <w:p>
+            <w:r>
+              <w:t xml:space="preserve">Phone </w:t>
+            </w:r>
+          </w:p>
+        </w:tc>
+      </w:tr>
+      <w:tr>
+        <w:tc>
+          <w:tcPr>
+            <w:tcW w:w="1803" w:type="dxa"/>
+          </w:tcPr>
+          <w:p>
+            <w:r>
+              <w:t>3</w:t>
+            </w:r>
+          </w:p>
+        </w:tc>
+        <w:tc>
+          <w:tcPr>
+            <w:tcW w:w="1803" w:type="dxa"/>
+          </w:tcPr>
+          <w:p>
+            <w:r>
+              <w:t>12/10/26</w:t>
+            </w:r>
+          </w:p>
+        </w:tc>
+        <w:tc>
+          <w:tcPr>
+            <w:tcW w:w="1803" w:type="dxa"/>
+          </w:tcPr>
+          <w:p>
+            <w:r>
+              <w:t>08:53</w:t>
+            </w:r>
+          </w:p>
+        </w:tc>
+        <w:tc>
+          <w:tcPr>
+            <w:tcW w:w="1803" w:type="dxa"/>
+          </w:tcPr>
+          <w:p>
+            <w:r>
+              <w:t>Waiting for lecture</w:t>
+            </w:r>
+          </w:p>
+        </w:tc>
+        <w:tc>
+          <w:tcPr>
+            <w:tcW w:w="1804" w:type="dxa"/>
+          </w:tcPr>
+          <w:p>
+            <w:r>
+              <w:t xml:space="preserve">Phone </w:t>
+            </w:r>
+          </w:p>
+        </w:tc>
+      </w:tr>
+      <w:tr>
+        <w:tc>
+          <w:tcPr>
+            <w:tcW w:w="1803" w:type="dxa"/>
+          </w:tcPr>
+          <w:p>
+            <w:r>
+              <w:t>4</w:t>
+            </w:r>
+          </w:p>
+        </w:tc>
+        <w:tc>
+          <w:tcPr>
+            <w:tcW w:w="1803" w:type="dxa"/>
+          </w:tcPr>
+          <w:p>
+            <w:r>
+              <w:t>12/10/26</w:t>
+            </w:r>
+          </w:p>
+        </w:tc>
+        <w:tc>
+          <w:tcPr>
+            <w:tcW w:w="1803" w:type="dxa"/>
+          </w:tcPr>
+          <w:p>
+            <w:r>
+              <w:t>11:37</w:t>
+            </w:r>
+          </w:p>
+        </w:tc>
+        <w:tc>
+          <w:tcPr>
+            <w:tcW w:w="1803" w:type="dxa"/>
+          </w:tcPr>
+          <w:p>
+            <w:r>
+              <w:t>Checking time until break</w:t>
+            </w:r>
+          </w:p>
+        </w:tc>
+        <w:tc>
+          <w:tcPr>
+            <w:tcW w:w="1804" w:type="dxa"/>
+          </w:tcPr>
+          <w:p>
+            <w:r>
+              <w:t xml:space="preserve">Laptop </w:t>
+            </w:r>
+          </w:p>
+        </w:tc>
+      </w:tr>
+      <w:tr>
+        <w:tc>
+          <w:tcPr>
+            <w:tcW w:w="1803" w:type="dxa"/>
+          </w:tcPr>
+          <w:p>
+            <w:r>
+              <w:t>5</w:t>
+            </w:r>
+          </w:p>
+        </w:tc>
+        <w:tc>
+          <w:tcPr>
+            <w:tcW w:w="1803" w:type="dxa"/>
+          </w:tcPr>
+          <w:p>
+            <w:r>
+              <w:t>12/10/26</w:t>
+            </w:r>
+          </w:p>
+        </w:tc>
+        <w:tc>
+          <w:tcPr>
+            <w:tcW w:w="1803" w:type="dxa"/>
+          </w:tcPr>
+          <w:p>
+            <w:r>
+              <w:t>16:08</w:t>
+            </w:r>
+          </w:p>
+        </w:tc>
+        <w:tc>
+          <w:tcPr>
+            <w:tcW w:w="1803" w:type="dxa"/>
+          </w:tcPr>
+          <w:p>
+            <w:r>
+              <w:t>Checking when I go home</w:t>
+            </w:r>
+          </w:p>
+        </w:tc>
+        <w:tc>
+          <w:tcPr>
+            <w:tcW w:w="1804" w:type="dxa"/>
+          </w:tcPr>
+          <w:p>
+            <w:r>
+              <w:t>Phone</w:t>
+            </w:r>
+          </w:p>
+          <w:p/>
+        </w:tc>
+      </w:tr>
+      <w:tr>
+        <w:tc>
+          <w:tcPr>
+            <w:tcW w:w="1803" w:type="dxa"/>
+          </w:tcPr>
+          <w:p>
+            <w:r>
+              <w:t>6</w:t>
+            </w:r>
+          </w:p>
+        </w:tc>
+        <w:tc>
+          <w:tcPr>
+            <w:tcW w:w="1803" w:type="dxa"/>
+          </w:tcPr>
+          <w:p>
+            <w:r>
+              <w:t>12/10/26</w:t>
+            </w:r>
+          </w:p>
+        </w:tc>
+        <w:tc>
+          <w:tcPr>
+            <w:tcW w:w="1803" w:type="dxa"/>
+          </w:tcPr>
+          <w:p>
+            <w:r>
+              <w:t>21:46</w:t>
+            </w:r>
+          </w:p>
+        </w:tc>
+        <w:tc>
+          <w:tcPr>
+            <w:tcW w:w="1803" w:type="dxa"/>
+          </w:tcPr>
+          <w:p>
+            <w:r>
+              <w:t>Checking how late it is</w:t>
+            </w:r>
+          </w:p>
+        </w:tc>
+        <w:tc>
+          <w:tcPr>
+            <w:tcW w:w="1804" w:type="dxa"/>
+          </w:tcPr>
+          <w:p>
+            <w:r>
+              <w:t xml:space="preserve">Phone </w:t>
+            </w:r>
+          </w:p>
+        </w:tc>
+      </w:tr>
+      <w:tr>
+        <w:tc>
+          <w:tcPr>
+            <w:tcW w:w="1803" w:type="dxa"/>
+          </w:tcPr>
+          <w:p>
+            <w:r>
+              <w:t>7</w:t>
+            </w:r>
+          </w:p>
+        </w:tc>
+        <w:tc>
+          <w:tcPr>
+            <w:tcW w:w="1803" w:type="dxa"/>
+          </w:tcPr>
+          <w:p>
+            <w:r>
+              <w:t>13/10/26</w:t>
+            </w:r>
+          </w:p>
+        </w:tc>
+        <w:tc>
+          <w:tcPr>
+            <w:tcW w:w="1803" w:type="dxa"/>
+          </w:tcPr>
+          <w:p>
+            <w:r>
+              <w:t>07:24</w:t>
+            </w:r>
+          </w:p>
+        </w:tc>
+        <w:tc>
+          <w:tcPr>
+            <w:tcW w:w="1803" w:type="dxa"/>
+          </w:tcPr>
+          <w:p>
+            <w:r>
+              <w:t>Checking time after waking up</w:t>
+            </w:r>
+          </w:p>
+        </w:tc>
+        <w:tc>
+          <w:tcPr>
+            <w:tcW w:w="1804" w:type="dxa"/>
+          </w:tcPr>
+          <w:p>
+            <w:r>
+              <w:t>Phone</w:t>
+            </w:r>
+          </w:p>
+          <w:p/>
+        </w:tc>
+      </w:tr>
+      <w:tr>
+        <w:tc>
+          <w:tcPr>
+            <w:tcW w:w="1803" w:type="dxa"/>
+          </w:tcPr>
+          <w:p>
+            <w:r>
+              <w:t>8</w:t>
+            </w:r>
+          </w:p>
+        </w:tc>
+        <w:tc>
+          <w:tcPr>
+            <w:tcW w:w="1803" w:type="dxa"/>
+          </w:tcPr>
+          <w:p>
+            <w:r>
+              <w:t>13/10/26</w:t>
+            </w:r>
+          </w:p>
+        </w:tc>
+        <w:tc>
+          <w:tcPr>
+            <w:tcW w:w="1803" w:type="dxa"/>
+          </w:tcPr>
+          <w:p>
+            <w:r>
+              <w:t>08:11</w:t>
+            </w:r>
+          </w:p>
+        </w:tc>
+        <w:tc>
+          <w:tcPr>
+            <w:tcW w:w="1803" w:type="dxa"/>
+          </w:tcPr>
+          <w:p>
+            <w:r>
+              <w:t xml:space="preserve">Getting ready for uni </w:t>
+            </w:r>
+          </w:p>
+        </w:tc>
+        <w:tc>
+          <w:tcPr>
+            <w:tcW w:w="1804" w:type="dxa"/>
+          </w:tcPr>
+          <w:p>
+            <w:r>
+              <w:t xml:space="preserve">Phone </w:t>
+            </w:r>
+          </w:p>
+        </w:tc>
+      </w:tr>
+      <w:tr>
+        <w:tc>
+          <w:tcPr>
+            <w:tcW w:w="1803" w:type="dxa"/>
+          </w:tcPr>
+          <w:p>
+            <w:r>
+              <w:t>9</w:t>
+            </w:r>
+          </w:p>
+        </w:tc>
+        <w:tc>
+          <w:tcPr>
+            <w:tcW w:w="1803" w:type="dxa"/>
+          </w:tcPr>
+          <w:p>
+            <w:r>
+              <w:t>13/10/26</w:t>
+            </w:r>
+          </w:p>
+        </w:tc>
+        <w:tc>
+          <w:tcPr>
+            <w:tcW w:w="1803" w:type="dxa"/>
+          </w:tcPr>
+          <w:p>
+            <w:r>
+              <w:t>08:47</w:t>
+            </w:r>
+          </w:p>
+        </w:tc>
+        <w:tc>
+          <w:tcPr>
+            <w:tcW w:w="1803" w:type="dxa"/>
+          </w:tcPr>
+          <w:p>
+            <w:r>
+              <w:t xml:space="preserve">Checking time before class </w:t>
+            </w:r>
+          </w:p>
+        </w:tc>
+        <w:tc>
+          <w:tcPr>
+            <w:tcW w:w="1804" w:type="dxa"/>
+          </w:tcPr>
+          <w:p>
+            <w:r>
+              <w:t xml:space="preserve">Phone </w:t>
+            </w:r>
+          </w:p>
+        </w:tc>
+      </w:tr>
+      <w:tr>
+        <w:tc>
+          <w:tcPr>
+            <w:tcW w:w="1803" w:type="dxa"/>
+          </w:tcPr>
+          <w:p>
+            <w:r>
+              <w:t>10</w:t>
+            </w:r>
+          </w:p>
+        </w:tc>
+        <w:tc>
+          <w:tcPr>
+            <w:tcW w:w="1803" w:type="dxa"/>
+          </w:tcPr>
+          <w:p>
+            <w:r>
+              <w:t>13/10/26</w:t>
+            </w:r>
+          </w:p>
+        </w:tc>
+        <w:tc>
+          <w:tcPr>
+            <w:tcW w:w="1803" w:type="dxa"/>
+          </w:tcPr>
+          <w:p>
+            <w:r>
+              <w:t>10:56</w:t>
+            </w:r>
+          </w:p>
+        </w:tc>
+        <w:tc>
+          <w:tcPr>
+            <w:tcW w:w="1803" w:type="dxa"/>
+          </w:tcPr>
+          <w:p>
+            <w:r>
+              <w:t xml:space="preserve">Waiting for next lecture </w:t>
+            </w:r>
+          </w:p>
+        </w:tc>
+        <w:tc>
+          <w:tcPr>
+            <w:tcW w:w="1804" w:type="dxa"/>
+          </w:tcPr>
+          <w:p>
+            <w:r>
+              <w:t xml:space="preserve">Laptop </w:t>
+            </w:r>
+          </w:p>
+        </w:tc>
+      </w:tr>
+      <w:tr>
+        <w:tc>
+          <w:tcPr>
+            <w:tcW w:w="1803" w:type="dxa"/>
+          </w:tcPr>
+          <w:p>
+            <w:r>
+              <w:t>11</w:t>
+            </w:r>
+          </w:p>
+        </w:tc>
+        <w:tc>
+          <w:tcPr>
+            <w:tcW w:w="1803" w:type="dxa"/>
+          </w:tcPr>
+          <w:p>
+            <w:r>
+              <w:t>13/10/26</w:t>
+            </w:r>
+          </w:p>
+        </w:tc>
+        <w:tc>
+          <w:tcPr>
+            <w:tcW w:w="1803" w:type="dxa"/>
+          </w:tcPr>
+          <w:p>
+            <w:r>
+              <w:t>14:38</w:t>
+            </w:r>
+          </w:p>
+        </w:tc>
+        <w:tc>
+          <w:tcPr>
+            <w:tcW w:w="1803" w:type="dxa"/>
+          </w:tcPr>
+          <w:p>
+            <w:r>
+              <w:t>Checking travel time hone</w:t>
+            </w:r>
+          </w:p>
+        </w:tc>
+        <w:tc>
+          <w:tcPr>
+            <w:tcW w:w="1804" w:type="dxa"/>
+          </w:tcPr>
+          <w:p>
+            <w:r>
+              <w:t>phone</w:t>
+            </w:r>
+          </w:p>
+        </w:tc>
+      </w:tr>
+      <w:tr>
+        <w:tc>
+          <w:tcPr>
+            <w:tcW w:w="1803" w:type="dxa"/>
+          </w:tcPr>
+          <w:p>
+            <w:r>
+              <w:t>12</w:t>
+            </w:r>
+          </w:p>
+        </w:tc>
+        <w:tc>
+          <w:tcPr>
+            <w:tcW w:w="1803" w:type="dxa"/>
+          </w:tcPr>
+          <w:p>
+            <w:r>
+              <w:t>13/10/26</w:t>
+            </w:r>
+          </w:p>
+        </w:tc>
+        <w:tc>
+          <w:tcPr>
+            <w:tcW w:w="1803" w:type="dxa"/>
+          </w:tcPr>
+          <w:p>
+            <w:r>
+              <w:t>20:17</w:t>
+            </w:r>
+          </w:p>
+        </w:tc>
+        <w:tc>
+          <w:tcPr>
+            <w:tcW w:w="1803" w:type="dxa"/>
+          </w:tcPr>
+          <w:p>
+            <w:r>
+              <w:t xml:space="preserve">Checking study time </w:t>
+            </w:r>
+          </w:p>
+        </w:tc>
+        <w:tc>
+          <w:tcPr>
+            <w:tcW w:w="1804" w:type="dxa"/>
+          </w:tcPr>
+          <w:p>
+            <w:r>
+              <w:t xml:space="preserve">Laptop </w:t>
+            </w:r>
+          </w:p>
+        </w:tc>
+      </w:tr>
+      <w:tr>
+        <w:tc>
+          <w:tcPr>
+            <w:tcW w:w="1803" w:type="dxa"/>
+          </w:tcPr>
+          <w:p>
+            <w:r>
+              <w:t>13</w:t>
+            </w:r>
+          </w:p>
+        </w:tc>
+        <w:tc>
+          <w:tcPr>
+            <w:tcW w:w="1803" w:type="dxa"/>
+          </w:tcPr>
+          <w:p>
+            <w:r>
+              <w:t>1</w:t>
+            </w:r>
+            <w:r>
+              <w:t>4</w:t>
+            </w:r>
+            <w:r>
+              <w:t>/10/26</w:t>
+            </w:r>
+          </w:p>
+        </w:tc>
+        <w:tc>
+          <w:tcPr>
+            <w:tcW w:w="1803" w:type="dxa"/>
+          </w:tcPr>
+          <w:p>
+            <w:r>
+              <w:t>08:39</w:t>
+            </w:r>
+          </w:p>
+        </w:tc>
+        <w:tc>
+          <w:tcPr>
+            <w:tcW w:w="1803" w:type="dxa"/>
+          </w:tcPr>
+          <w:p>
+            <w:r>
+              <w:t xml:space="preserve">Just woke up </w:t>
+            </w:r>
+          </w:p>
+        </w:tc>
+        <w:tc>
+          <w:tcPr>
+            <w:tcW w:w="1804" w:type="dxa"/>
+          </w:tcPr>
+          <w:p>
+            <w:r>
+              <w:t>Phone</w:t>
+            </w:r>
+          </w:p>
+        </w:tc>
+      </w:tr>
+      <w:tr>
+        <w:tc>
+          <w:tcPr>
+            <w:tcW w:w="1803" w:type="dxa"/>
+          </w:tcPr>
+          <w:p>
+            <w:r>
+              <w:t>14</w:t>
+            </w:r>
+          </w:p>
+        </w:tc>
+        <w:tc>
+          <w:tcPr>
+            <w:tcW w:w="1803" w:type="dxa"/>
+          </w:tcPr>
+          <w:p>
+            <w:r>
+              <w:t>1</w:t>
+            </w:r>
+            <w:r>
+              <w:t>4</w:t>
+            </w:r>
+            <w:r>
+              <w:t>/10/26</w:t>
+            </w:r>
+          </w:p>
+        </w:tc>
+        <w:tc>
+          <w:tcPr>
+            <w:tcW w:w="1803" w:type="dxa"/>
+          </w:tcPr>
+          <w:p>
+            <w:r>
+              <w:t>10:17</w:t>
+            </w:r>
+          </w:p>
+        </w:tc>
+        <w:tc>
+          <w:tcPr>
+            <w:tcW w:w="1803" w:type="dxa"/>
+          </w:tcPr>
+          <w:p>
+            <w:r>
+              <w:t xml:space="preserve">Checking study schedule </w:t>
+            </w:r>
+          </w:p>
+        </w:tc>
+        <w:tc>
+          <w:tcPr>
+            <w:tcW w:w="1804" w:type="dxa"/>
+          </w:tcPr>
+          <w:p>
+            <w:r>
+              <w:t xml:space="preserve">Phone </w:t>
+            </w:r>
+          </w:p>
+        </w:tc>
+      </w:tr>
+      <w:tr>
+        <w:tc>
+          <w:tcPr>
+            <w:tcW w:w="1803" w:type="dxa"/>
+          </w:tcPr>
+          <w:p>
+            <w:r>
+              <w:t>15</w:t>
+            </w:r>
+          </w:p>
+        </w:tc>
+        <w:tc>
+          <w:tcPr>
+            <w:tcW w:w="1803" w:type="dxa"/>
+          </w:tcPr>
+          <w:p>
+            <w:r>
+              <w:t>1</w:t>
+            </w:r>
+            <w:r>
+              <w:t>4</w:t>
+            </w:r>
+            <w:r>
+              <w:t>/10/26</w:t>
+            </w:r>
+          </w:p>
+        </w:tc>
+        <w:tc>
+          <w:tcPr>
+            <w:tcW w:w="1803" w:type="dxa"/>
+          </w:tcPr>
+          <w:p>
+            <w:r>
+              <w:t>11:43</w:t>
+            </w:r>
+          </w:p>
+        </w:tc>
+        <w:tc>
+          <w:tcPr>
+            <w:tcW w:w="1803" w:type="dxa"/>
+          </w:tcPr>
+          <w:p>
+            <w:r>
+              <w:t xml:space="preserve">Getting ready to go uni </w:t>
+            </w:r>
+          </w:p>
+        </w:tc>
+        <w:tc>
+          <w:tcPr>
+            <w:tcW w:w="1804" w:type="dxa"/>
+          </w:tcPr>
+          <w:p>
+            <w:r>
+              <w:t>phone</w:t>
+            </w:r>
+          </w:p>
+        </w:tc>
+      </w:tr>
+      <w:tr>
+        <w:tc>
+          <w:tcPr>
+            <w:tcW w:w="1803" w:type="dxa"/>
+          </w:tcPr>
+          <w:p>
+            <w:pPr>
+              <w:tabs>
+                <w:tab w:val="left" w:pos="1060"/>
+              </w:tabs>
+            </w:pPr>
+            <w:r>
+              <w:t>16</w:t>
+            </w:r>
+            <w:r>
+              <w:tab/>
+            </w:r>
+          </w:p>
+        </w:tc>
+        <w:tc>
+          <w:tcPr>
+            <w:tcW w:w="1803" w:type="dxa"/>
+          </w:tcPr>
+          <w:p>
+            <w:r>
+              <w:t>1</w:t>
+            </w:r>
+            <w:r>
+              <w:t>4</w:t>
+            </w:r>
+            <w:r>
+              <w:t>/10/26</w:t>
+            </w:r>
+          </w:p>
+        </w:tc>
+        <w:tc>
+          <w:tcPr>
+            <w:tcW w:w="1803" w:type="dxa"/>
+          </w:tcPr>
+          <w:p>
+            <w:r>
+              <w:t>12:58</w:t>
+            </w:r>
+          </w:p>
+        </w:tc>
+        <w:tc>
+          <w:tcPr>
+            <w:tcW w:w="1803" w:type="dxa"/>
+          </w:tcPr>
+          <w:p>
+            <w:r>
+              <w:t xml:space="preserve">Checking time during break </w:t>
+            </w:r>
+          </w:p>
+        </w:tc>
+        <w:tc>
+          <w:tcPr>
+            <w:tcW w:w="1804" w:type="dxa"/>
+          </w:tcPr>
+          <w:p>
+            <w:r>
+              <w:t xml:space="preserve">Phone </w:t>
+            </w:r>
+          </w:p>
+        </w:tc>
+      </w:tr>
+      <w:tr>
+        <w:tc>
+          <w:tcPr>
+            <w:tcW w:w="1803" w:type="dxa"/>
+          </w:tcPr>
+          <w:p>
+            <w:pPr>
+              <w:tabs>
+                <w:tab w:val="left" w:pos="1060"/>
+              </w:tabs>
+            </w:pPr>
+            <w:r>
+              <w:t>17</w:t>
+            </w:r>
+          </w:p>
+        </w:tc>
+        <w:tc>
+          <w:tcPr>
+            <w:tcW w:w="1803" w:type="dxa"/>
+          </w:tcPr>
+          <w:p>
+            <w:r>
+              <w:t>1</w:t>
+            </w:r>
+            <w:r>
+              <w:t>4</w:t>
+            </w:r>
+            <w:r>
+              <w:t>/10/26</w:t>
+            </w:r>
+          </w:p>
+        </w:tc>
+        <w:tc>
+          <w:tcPr>
+            <w:tcW w:w="1803" w:type="dxa"/>
+          </w:tcPr>
+          <w:p>
+            <w:r>
+              <w:t>17:26</w:t>
+            </w:r>
+          </w:p>
+        </w:tc>
+        <w:tc>
+          <w:tcPr>
+            <w:tcW w:w="1803" w:type="dxa"/>
+          </w:tcPr>
+          <w:p>
+            <w:r>
+              <w:t xml:space="preserve">Checking how long I’ve studied </w:t>
+            </w:r>
+          </w:p>
+        </w:tc>
+        <w:tc>
+          <w:tcPr>
+            <w:tcW w:w="1804" w:type="dxa"/>
+          </w:tcPr>
+          <w:p>
+            <w:r>
+              <w:t xml:space="preserve">Laptop </w:t>
+            </w:r>
+          </w:p>
+        </w:tc>
+      </w:tr>
+      <w:tr>
+        <w:tc>
+          <w:tcPr>
+            <w:tcW w:w="1803" w:type="dxa"/>
+          </w:tcPr>
+          <w:p>
+            <w:pPr>
+              <w:tabs>
+                <w:tab w:val="left" w:pos="1060"/>
+              </w:tabs>
+            </w:pPr>
+            <w:r>
+              <w:t>18</w:t>
+            </w:r>
+          </w:p>
+        </w:tc>
+        <w:tc>
+          <w:tcPr>
+            <w:tcW w:w="1803" w:type="dxa"/>
+          </w:tcPr>
+          <w:p>
+            <w:r>
+              <w:t>1</w:t>
+            </w:r>
+            <w:r>
+              <w:t>4</w:t>
+            </w:r>
+            <w:r>
+              <w:t>/10/26</w:t>
+            </w:r>
+          </w:p>
+        </w:tc>
+        <w:tc>
+          <w:tcPr>
+            <w:tcW w:w="1803" w:type="dxa"/>
+          </w:tcPr>
+          <w:p>
+            <w:r>
+              <w:t>22:34</w:t>
+            </w:r>
+          </w:p>
+        </w:tc>
+        <w:tc>
+          <w:tcPr>
+            <w:tcW w:w="1803" w:type="dxa"/>
+          </w:tcPr>
+          <w:p>
+            <w:r>
+              <w:t xml:space="preserve">Checking time before sleeping </w:t>
+            </w:r>
+          </w:p>
+        </w:tc>
+        <w:tc>
+          <w:tcPr>
+            <w:tcW w:w="1804" w:type="dxa"/>
+          </w:tcPr>
+          <w:p>
+            <w:r>
+              <w:t xml:space="preserve">Phone </w:t>
+            </w:r>
+          </w:p>
+        </w:tc>
+      </w:tr>
+      <w:tr>
+        <w:tc>
+          <w:tcPr>
+            <w:tcW w:w="1803" w:type="dxa"/>
+          </w:tcPr>
+          <w:p>
+            <w:pPr>
+              <w:tabs>
+                <w:tab w:val="left" w:pos="1060"/>
+              </w:tabs>
+            </w:pPr>
+            <w:r>
+              <w:t>19</w:t>
+            </w:r>
+          </w:p>
+        </w:tc>
+        <w:tc>
+          <w:tcPr>
+            <w:tcW w:w="1803" w:type="dxa"/>
+          </w:tcPr>
+          <w:p>
+            <w:r>
+              <w:t>1</w:t>
+            </w:r>
+            <w:r>
+              <w:t>5</w:t>
+            </w:r>
+            <w:r>
+              <w:t>/10/26</w:t>
+            </w:r>
+          </w:p>
+        </w:tc>
+        <w:tc>
+          <w:tcPr>
+            <w:tcW w:w="1803" w:type="dxa"/>
+          </w:tcPr>
+          <w:p>
+            <w:r>
+              <w:t>09:26</w:t>
+            </w:r>
+          </w:p>
+        </w:tc>
+        <w:tc>
+          <w:tcPr>
+            <w:tcW w:w="1803" w:type="dxa"/>
+          </w:tcPr>
+          <w:p>
+            <w:r>
+              <w:t xml:space="preserve">Just woke up </w:t>
+            </w:r>
+          </w:p>
+        </w:tc>
+        <w:tc>
+          <w:tcPr>
+            <w:tcW w:w="1804" w:type="dxa"/>
+          </w:tcPr>
+          <w:p>
+            <w:r>
+              <w:t xml:space="preserve">Phone </w:t>
+            </w:r>
+          </w:p>
+        </w:tc>
+      </w:tr>
+    </w:tbl>
+    <w:p/>
     <w:sectPr>
       <w:pgSz w:w="11906" w:h="16838"/>
       <w:pgMar w:top="1440" w:right="1440" w:bottom="1440" w:left="1440" w:header="708" w:footer="708" w:gutter="0"/>
@@ -620,7 +1747,6 @@
   <w:style w:type="character" w:default="1" w:styleId="DefaultParagraphFont">
     <w:name w:val="Default Paragraph Font"/>
     <w:uiPriority w:val="1"/>
-    <w:semiHidden/>
     <w:unhideWhenUsed/>
   </w:style>
   <w:style w:type="table" w:default="1" w:styleId="TableNormal">
@@ -933,6 +2059,25 @@
       <w:color w:val="0F4761" w:themeColor="accent1" w:themeShade="BF"/>
       <w:spacing w:val="5"/>
     </w:rPr>
+  </w:style>
+  <w:style w:type="table" w:styleId="TableGrid">
+    <w:name w:val="Table Grid"/>
+    <w:basedOn w:val="TableNormal"/>
+    <w:uiPriority w:val="39"/>
+    <w:rsid w:val="007D7E26"/>
+    <w:pPr>
+      <w:spacing w:after="0" w:line="240" w:lineRule="auto"/>
+    </w:pPr>
+    <w:tblPr>
+      <w:tblBorders>
+        <w:top w:val="single" w:sz="4" w:space="0" w:color="auto"/>
+        <w:left w:val="single" w:sz="4" w:space="0" w:color="auto"/>
+        <w:bottom w:val="single" w:sz="4" w:space="0" w:color="auto"/>
+        <w:right w:val="single" w:sz="4" w:space="0" w:color="auto"/>
+        <w:insideH w:val="single" w:sz="4" w:space="0" w:color="auto"/>
+        <w:insideV w:val="single" w:sz="4" w:space="0" w:color="auto"/>
+      </w:tblBorders>
+    </w:tblPr>
   </w:style>
 </w:styles>
 </file>

</xml_diff>